<commit_message>
Euler66 2026 end of sets
</commit_message>
<xml_diff>
--- a/Project euler/Euler66/2026 Formulas.docx
+++ b/Project euler/Euler66/2026 Formulas.docx
@@ -3445,6 +3445,314 @@
         <w:t>It should be more efficient to square all odd numbers, instead of multiplying prime numbers. I could make a loop and only add instead of multiplying, even better.</w:t>
       </w:r>
     </w:p>
+    <w:p>
+      <w:pPr>
+        <w:spacing w:after="0"/>
+        <w:rPr>
+          <w:rFonts w:eastAsiaTheme="minorEastAsia"/>
+        </w:rPr>
+      </w:pPr>
+      <w:r>
+        <w:rPr>
+          <w:rFonts w:eastAsiaTheme="minorEastAsia"/>
+        </w:rPr>
+        <w:br w:type="page"/>
+      </w:r>
+    </w:p>
+    <w:p>
+      <w:pPr>
+        <w:rPr>
+          <w:rFonts w:eastAsiaTheme="minorEastAsia"/>
+        </w:rPr>
+      </w:pPr>
+      <w:r>
+        <w:rPr>
+          <w:rFonts w:eastAsiaTheme="minorEastAsia"/>
+        </w:rPr>
+        <w:lastRenderedPageBreak/>
+        <w:t>After testing I can confirm that k has either 1 or 0 factor twos. And k+-2 has 0 if k has 0, and otherwise it has an odd amount.</w:t>
+      </w:r>
+      <w:r>
+        <w:rPr>
+          <w:rFonts w:eastAsiaTheme="minorEastAsia"/>
+        </w:rPr>
+        <w:br/>
+        <w:t>So I could skip all sets, and cycle through k by squaring all odd numbers, and in paralell squaring all odd numbers times two, and always using the smaller one.</w:t>
+      </w:r>
+      <w:r>
+        <w:rPr>
+          <w:rFonts w:eastAsiaTheme="minorEastAsia"/>
+        </w:rPr>
+        <w:br/>
+        <w:t>And then calculating kd+2 and kd-2.</w:t>
+      </w:r>
+      <w:r>
+        <w:rPr>
+          <w:rFonts w:eastAsiaTheme="minorEastAsia"/>
+        </w:rPr>
+        <w:br/>
+        <w:t>And then removing all twos and checking that the amount is even.</w:t>
+      </w:r>
+      <w:r>
+        <w:rPr>
+          <w:rFonts w:eastAsiaTheme="minorEastAsia"/>
+        </w:rPr>
+        <w:br/>
+        <w:t>And then calculating the root of the remainder by Babylonian method.</w:t>
+      </w:r>
+      <w:r>
+        <w:rPr>
+          <w:rFonts w:eastAsiaTheme="minorEastAsia"/>
+        </w:rPr>
+        <w:br/>
+      </w:r>
+      <w:r>
+        <w:rPr>
+          <w:rFonts w:eastAsiaTheme="minorEastAsia"/>
+          <w:lang w:val="en-SE"/>
+        </w:rPr>
+        <w:t>def babylonian(n):</w:t>
+      </w:r>
+      <w:r>
+        <w:rPr>
+          <w:rFonts w:eastAsiaTheme="minorEastAsia"/>
+          <w:lang w:val="en-SE"/>
+        </w:rPr>
+        <w:br/>
+      </w:r>
+      <w:r>
+        <w:rPr>
+          <w:rFonts w:eastAsiaTheme="minorEastAsia"/>
+          <w:lang w:val="en-SE"/>
+        </w:rPr>
+        <w:t>x = n</w:t>
+      </w:r>
+      <w:r>
+        <w:rPr>
+          <w:rFonts w:eastAsiaTheme="minorEastAsia"/>
+          <w:lang w:val="en-SE"/>
+        </w:rPr>
+        <w:br/>
+      </w:r>
+      <w:r>
+        <w:rPr>
+          <w:rFonts w:eastAsiaTheme="minorEastAsia"/>
+          <w:lang w:val="en-SE"/>
+        </w:rPr>
+        <w:t>y = 1</w:t>
+      </w:r>
+      <w:r>
+        <w:rPr>
+          <w:rFonts w:eastAsiaTheme="minorEastAsia"/>
+          <w:lang w:val="en-SE"/>
+        </w:rPr>
+        <w:br/>
+      </w:r>
+      <w:r>
+        <w:rPr>
+          <w:rFonts w:eastAsiaTheme="minorEastAsia"/>
+          <w:lang w:val="en-SE"/>
+        </w:rPr>
+        <w:t>while(x &gt; y):</w:t>
+      </w:r>
+      <w:r>
+        <w:rPr>
+          <w:rFonts w:eastAsiaTheme="minorEastAsia"/>
+          <w:lang w:val="en-SE"/>
+        </w:rPr>
+        <w:br/>
+      </w:r>
+      <w:r>
+        <w:rPr>
+          <w:rFonts w:eastAsiaTheme="minorEastAsia"/>
+          <w:lang w:val="en-SE"/>
+        </w:rPr>
+        <w:t xml:space="preserve">    x = (x+y)//2</w:t>
+      </w:r>
+      <w:r>
+        <w:rPr>
+          <w:rFonts w:eastAsiaTheme="minorEastAsia"/>
+          <w:lang w:val="en-SE"/>
+        </w:rPr>
+        <w:br/>
+      </w:r>
+      <w:r>
+        <w:rPr>
+          <w:rFonts w:eastAsiaTheme="minorEastAsia"/>
+          <w:lang w:val="en-SE"/>
+        </w:rPr>
+        <w:t xml:space="preserve">    y = n//x</w:t>
+      </w:r>
+      <w:r>
+        <w:rPr>
+          <w:rFonts w:eastAsiaTheme="minorEastAsia"/>
+          <w:lang w:val="en-SE"/>
+        </w:rPr>
+        <w:br/>
+      </w:r>
+      <w:r>
+        <w:rPr>
+          <w:rFonts w:eastAsiaTheme="minorEastAsia"/>
+          <w:lang w:val="en-SE"/>
+        </w:rPr>
+        <w:t>return x</w:t>
+      </w:r>
+      <w:r>
+        <w:rPr>
+          <w:rFonts w:eastAsiaTheme="minorEastAsia"/>
+          <w:lang w:val="en-SE"/>
+        </w:rPr>
+        <w:br/>
+      </w:r>
+      <w:r>
+        <w:rPr>
+          <w:rFonts w:eastAsiaTheme="minorEastAsia"/>
+        </w:rPr>
+        <w:t>O(log(log(n))</w:t>
+      </w:r>
+      <w:r>
+        <w:rPr>
+          <w:rFonts w:eastAsiaTheme="minorEastAsia"/>
+        </w:rPr>
+        <w:t xml:space="preserve"> (</w:t>
+      </w:r>
+      <w:r>
+        <w:rPr>
+          <w:rFonts w:eastAsiaTheme="minorEastAsia"/>
+        </w:rPr>
+        <w:t>but has</w:t>
+      </w:r>
+      <w:r>
+        <w:rPr>
+          <w:rFonts w:eastAsiaTheme="minorEastAsia"/>
+        </w:rPr>
+        <w:t xml:space="preserve"> //x)</w:t>
+      </w:r>
+    </w:p>
+    <w:p>
+      <w:pPr>
+        <w:rPr>
+          <w:rFonts w:eastAsiaTheme="minorEastAsia"/>
+          <w:lang w:val="en-SE"/>
+        </w:rPr>
+      </w:pPr>
+      <w:r>
+        <w:rPr>
+          <w:rFonts w:eastAsiaTheme="minorEastAsia"/>
+        </w:rPr>
+        <w:t>One can also do</w:t>
+      </w:r>
+      <w:r>
+        <w:rPr>
+          <w:rFonts w:eastAsiaTheme="minorEastAsia"/>
+        </w:rPr>
+        <w:t xml:space="preserve"> binary seach</w:t>
+      </w:r>
+      <w:r>
+        <w:rPr>
+          <w:rFonts w:eastAsiaTheme="minorEastAsia"/>
+        </w:rPr>
+        <w:br/>
+        <w:t>left = 0</w:t>
+      </w:r>
+      <w:r>
+        <w:rPr>
+          <w:rFonts w:eastAsiaTheme="minorEastAsia"/>
+        </w:rPr>
+        <w:br/>
+        <w:t>right = n</w:t>
+      </w:r>
+      <w:r>
+        <w:rPr>
+          <w:rFonts w:eastAsiaTheme="minorEastAsia"/>
+        </w:rPr>
+        <w:br/>
+        <w:t>mid = (left + right) // 2</w:t>
+      </w:r>
+      <w:r>
+        <w:rPr>
+          <w:rFonts w:eastAsiaTheme="minorEastAsia"/>
+        </w:rPr>
+        <w:br/>
+        <w:t>if (mid*mid &gt;</w:t>
+      </w:r>
+      <w:r>
+        <w:rPr>
+          <w:rFonts w:eastAsiaTheme="minorEastAsia"/>
+        </w:rPr>
+        <w:t xml:space="preserve"> n)</w:t>
+      </w:r>
+      <w:r>
+        <w:rPr>
+          <w:rFonts w:eastAsiaTheme="minorEastAsia"/>
+        </w:rPr>
+        <w:br/>
+        <w:t xml:space="preserve">  left = mid+1</w:t>
+      </w:r>
+      <w:r>
+        <w:rPr>
+          <w:rFonts w:eastAsiaTheme="minorEastAsia"/>
+        </w:rPr>
+        <w:br/>
+        <w:t>if (mid*mid &lt; n)</w:t>
+      </w:r>
+      <w:r>
+        <w:rPr>
+          <w:rFonts w:eastAsiaTheme="minorEastAsia"/>
+        </w:rPr>
+        <w:br/>
+        <w:t xml:space="preserve">  right = mid-1</w:t>
+      </w:r>
+      <w:r>
+        <w:rPr>
+          <w:rFonts w:eastAsiaTheme="minorEastAsia"/>
+        </w:rPr>
+        <w:br/>
+      </w:r>
+      <w:r>
+        <w:rPr>
+          <w:rFonts w:eastAsiaTheme="minorEastAsia"/>
+          <w:lang w:val="en-SE"/>
+        </w:rPr>
+        <w:t>O(log(n))</w:t>
+      </w:r>
+      <w:r>
+        <w:rPr>
+          <w:rFonts w:eastAsiaTheme="minorEastAsia"/>
+          <w:lang w:val="en-SE"/>
+        </w:rPr>
+        <w:t xml:space="preserve"> (</w:t>
+      </w:r>
+      <w:r>
+        <w:rPr>
+          <w:rFonts w:eastAsiaTheme="minorEastAsia"/>
+          <w:lang w:val="en-SE"/>
+        </w:rPr>
+        <w:t>have only</w:t>
+      </w:r>
+      <w:r>
+        <w:rPr>
+          <w:rFonts w:eastAsiaTheme="minorEastAsia"/>
+          <w:lang w:val="en-SE"/>
+        </w:rPr>
+        <w:t xml:space="preserve"> +-*)</w:t>
+      </w:r>
+    </w:p>
+    <w:p>
+      <w:pPr>
+        <w:rPr>
+          <w:rFonts w:eastAsiaTheme="minorEastAsia"/>
+          <w:lang w:val="en-SE"/>
+        </w:rPr>
+      </w:pPr>
+      <w:r>
+        <w:rPr>
+          <w:rFonts w:eastAsiaTheme="minorEastAsia"/>
+          <w:lang w:val="en-SE"/>
+        </w:rPr>
+        <w:t>One can also do digit by digit, but Wikipedia sais its slower than Babylonian, and it sais its advantage is easier manual calculation, but worse for software, so I will not look into it.</w:t>
+      </w:r>
+    </w:p>
     <w:sectPr>
       <w:headerReference w:type="even" r:id="rId10"/>
       <w:headerReference w:type="default" r:id="rId11"/>
@@ -6240,7 +6548,6 @@
   <w:style w:type="character" w:default="1" w:styleId="DefaultParagraphFont">
     <w:name w:val="Default Paragraph Font"/>
     <w:uiPriority w:val="1"/>
-    <w:semiHidden/>
     <w:unhideWhenUsed/>
   </w:style>
   <w:style w:type="table" w:default="1" w:styleId="TableNormal">
@@ -31791,12 +32098,17 @@
   <w:rsids>
     <w:rsidRoot w:val="005919DB"/>
     <w:rsid w:val="000F585A"/>
+    <w:rsid w:val="003A0320"/>
     <w:rsid w:val="00430C01"/>
     <w:rsid w:val="00503955"/>
     <w:rsid w:val="005919DB"/>
+    <w:rsid w:val="00983888"/>
     <w:rsid w:val="00A15583"/>
+    <w:rsid w:val="00A539E1"/>
+    <w:rsid w:val="00AA0BAB"/>
     <w:rsid w:val="00BF18D8"/>
     <w:rsid w:val="00CD2EE2"/>
+    <w:rsid w:val="00CF353F"/>
     <w:rsid w:val="00E62CC3"/>
   </w:rsids>
   <m:mathPr>
@@ -32253,7 +32565,7 @@
     <w:basedOn w:val="DefaultParagraphFont"/>
     <w:uiPriority w:val="99"/>
     <w:semiHidden/>
-    <w:rsid w:val="000F585A"/>
+    <w:rsid w:val="00983888"/>
     <w:rPr>
       <w:color w:val="808080"/>
       <w:lang w:val="en-GB"/>
@@ -32629,33 +32941,33 @@
 </file>
 
 <file path=customXml/item1.xml><?xml version="1.0" encoding="utf-8"?>
+<TemplafyFormConfiguration><![CDATA[{"formFields":[],"formDataEntries":[]}]]></TemplafyFormConfiguration>
+</file>
+
+<file path=customXml/item2.xml><?xml version="1.0" encoding="utf-8"?>
+<b:Sources xmlns:b="http://schemas.openxmlformats.org/officeDocument/2006/bibliography" xmlns="http://schemas.openxmlformats.org/officeDocument/2006/bibliography" SelectedStyle="\APASixthEditionOfficeOnline.xsl" StyleName="APA" Version="6"/>
+</file>
+
+<file path=customXml/item3.xml><?xml version="1.0" encoding="utf-8"?>
 <TemplafyTemplateConfiguration><![CDATA[{"elementsMetadata":[{"elementConfiguration":{"binding":"{{Translate(\"Page\")}}","visibility":"","removeAndKeepContent":false,"disableUpdates":false,"type":"text"},"type":"richTextContentControl","id":"d8f13a97-bd69-40b8-9a13-1b18ad22c858"},{"elementConfiguration":{"binding":"{{Translate(\"of\")}}","visibility":"","removeAndKeepContent":false,"disableUpdates":false,"type":"text"},"type":"richTextContentControl","id":"8b53ee79-b08f-44c2-af36-e0e87726630a"},{"elementConfiguration":{"binding":"{{Translate(\"Page\")}}","visibility":"","removeAndKeepContent":false,"disableUpdates":false,"type":"text"},"type":"richTextContentControl","id":"7915e852-e592-4e84-bf6a-9d6130cfc4d8"},{"elementConfiguration":{"binding":"{{Translate(\"of\")}}","visibility":"","removeAndKeepContent":false,"disableUpdates":false,"type":"text"},"type":"richTextContentControl","id":"b573d83c-2b4c-4055-86a2-7d48d64f79d0"},{"elementConfiguration":{"binding":"{{Translate(\"Page\")}}","visibility":"","removeAndKeepContent":false,"disableUpdates":false,"type":"text"},"type":"richTextContentControl","id":"1ff07331-81a8-4ba4-8f75-aa0cc03a8006"},{"elementConfiguration":{"binding":"{{Translate(\"of\")}}","visibility":"","removeAndKeepContent":false,"disableUpdates":false,"type":"text"},"type":"richTextContentControl","id":"bbe5ef71-5fd2-4955-8029-900aa1fb69ed"},{"elementConfiguration":{"binding":"{{Translate(\"Page\")}}","visibility":"","removeAndKeepContent":false,"disableUpdates":false,"type":"text"},"type":"richTextContentControl","id":"4c5ff23d-248b-499e-b31c-2c9bee199050"},{"elementConfiguration":{"binding":"{{Translate(\"of\")}}","visibility":"","removeAndKeepContent":false,"disableUpdates":false,"type":"text"},"type":"richTextContentControl","id":"5446c589-411f-4e59-ae86-5d507fed838b"}],"transformationConfigurations":[{"language":"{{DocumentLanguage}}","disableUpdates":false,"type":"proofingLanguage"},{"image":"{{UserProfile.Business.LogoRef.ImageFileRef_NewBrand.ImageFile}}","shapeName":"LogoHide","width":"{{UserProfile.Business.LogoRef.LogoWidth_NewBrand}}","height":"","namedSections":"{{NamedSections.All}}","namedPages":"{{NamedPages.All}}","numberedSections":[],"leftOffset":"{{UserProfile.Business.LogoRef.LogoLeftOffset}}","horizontalRelativePosition":"{{HorizontalRelativePosition.Page}}","horizontalAlignment":"","topOffset":"{{UserProfile.Business.LogoRef.LogoTopOffset}}","verticalRelativePosition":"{{VerticalRelativePosition.Page}}","verticalAlignment":"","imageTextWrapping":"{{ImageTextWrapping.InFrontOfText}}","rotation":"","color":"","disableUpdates":false,"type":"imageHeader"}],"templateName":"Blank - Tieto Sans 07012026","templateDescription":"","enableDocumentContentUpdater":true,"version":"2.0"}]]></TemplafyTemplateConfiguration>
 </file>
 
-<file path=customXml/item2.xml><?xml version="1.0" encoding="utf-8"?>
-<TemplafyFormConfiguration><![CDATA[{"formFields":[],"formDataEntries":[]}]]></TemplafyFormConfiguration>
-</file>
-
-<file path=customXml/item3.xml><?xml version="1.0" encoding="utf-8"?>
-<b:Sources xmlns:b="http://schemas.openxmlformats.org/officeDocument/2006/bibliography" xmlns="http://schemas.openxmlformats.org/officeDocument/2006/bibliography" SelectedStyle="\APASixthEditionOfficeOnline.xsl" StyleName="APA" Version="6"/>
-</file>
-
 <file path=customXml/itemProps1.xml><?xml version="1.0" encoding="utf-8"?>
-<ds:datastoreItem xmlns:ds="http://schemas.openxmlformats.org/officeDocument/2006/customXml" ds:itemID="{9CA760B9-EF0C-422C-868B-3AE4595E10F0}">
+<ds:datastoreItem xmlns:ds="http://schemas.openxmlformats.org/officeDocument/2006/customXml" ds:itemID="{7694396B-369B-47A9-88F6-DD199771A934}">
   <ds:schemaRefs/>
 </ds:datastoreItem>
 </file>
 
 <file path=customXml/itemProps2.xml><?xml version="1.0" encoding="utf-8"?>
-<ds:datastoreItem xmlns:ds="http://schemas.openxmlformats.org/officeDocument/2006/customXml" ds:itemID="{7694396B-369B-47A9-88F6-DD199771A934}">
-  <ds:schemaRefs/>
-</ds:datastoreItem>
-</file>
-
-<file path=customXml/itemProps3.xml><?xml version="1.0" encoding="utf-8"?>
 <ds:datastoreItem xmlns:ds="http://schemas.openxmlformats.org/officeDocument/2006/customXml" ds:itemID="{0D558636-8D62-47AC-961F-8E83DD257B70}">
   <ds:schemaRefs>
     <ds:schemaRef ds:uri="http://schemas.openxmlformats.org/officeDocument/2006/bibliography"/>
   </ds:schemaRefs>
 </ds:datastoreItem>
+</file>
+
+<file path=customXml/itemProps3.xml><?xml version="1.0" encoding="utf-8"?>
+<ds:datastoreItem xmlns:ds="http://schemas.openxmlformats.org/officeDocument/2006/customXml" ds:itemID="{9CA760B9-EF0C-422C-868B-3AE4595E10F0}">
+  <ds:schemaRefs/>
+</ds:datastoreItem>
 </file>
</xml_diff>

<commit_message>
Euler66 2026 End of unsigned long long
</commit_message>
<xml_diff>
--- a/Project euler/Euler66/2026 Formulas.docx
+++ b/Project euler/Euler66/2026 Formulas.docx
@@ -1266,7 +1266,23 @@
           <w:rFonts w:eastAsiaTheme="minorEastAsia"/>
           <w:lang w:val="sv-SE"/>
         </w:rPr>
-        <w:t>Så om D är primtal (vilket antagligen är de enda vi behöver bry oss om, eftersom de andra blir så små att man kan använda brute force) så måste antingen x+1 eller x-1 vara en multipel av D.</w:t>
+        <w:t xml:space="preserve">Så om D är primtal (vilket antagligen är de enda vi behöver bry oss om, eftersom de andra blir så små att man kan använda </w:t>
+      </w:r>
+      <w:proofErr w:type="spellStart"/>
+      <w:r>
+        <w:rPr>
+          <w:rFonts w:eastAsiaTheme="minorEastAsia"/>
+          <w:lang w:val="sv-SE"/>
+        </w:rPr>
+        <w:t>brute</w:t>
+      </w:r>
+      <w:proofErr w:type="spellEnd"/>
+      <w:r>
+        <w:rPr>
+          <w:rFonts w:eastAsiaTheme="minorEastAsia"/>
+          <w:lang w:val="sv-SE"/>
+        </w:rPr>
+        <w:t xml:space="preserve"> force) så måste antingen x+1 eller x-1 vara en multipel av D.</w:t>
       </w:r>
       <w:r>
         <w:rPr>
@@ -1282,7 +1298,31 @@
           <w:lang w:val="sv-SE"/>
         </w:rPr>
         <w:br/>
-        <w:t>Om vi skriver x+1 eller x-1 som kD så får vi två ekvation</w:t>
+        <w:t xml:space="preserve">Om vi skriver x+1 eller x-1 som </w:t>
+      </w:r>
+      <w:proofErr w:type="spellStart"/>
+      <w:r>
+        <w:rPr>
+          <w:rFonts w:eastAsiaTheme="minorEastAsia"/>
+          <w:lang w:val="sv-SE"/>
+        </w:rPr>
+        <w:t>kD</w:t>
+      </w:r>
+      <w:proofErr w:type="spellEnd"/>
+      <w:r>
+        <w:rPr>
+          <w:rFonts w:eastAsiaTheme="minorEastAsia"/>
+          <w:lang w:val="sv-SE"/>
+        </w:rPr>
+        <w:t xml:space="preserve"> så får vi två </w:t>
+      </w:r>
+      <w:proofErr w:type="spellStart"/>
+      <w:r>
+        <w:rPr>
+          <w:rFonts w:eastAsiaTheme="minorEastAsia"/>
+          <w:lang w:val="sv-SE"/>
+        </w:rPr>
+        <w:t>ekvation</w:t>
       </w:r>
       <w:r>
         <w:rPr>
@@ -1291,6 +1331,7 @@
         </w:rPr>
         <w:t>par</w:t>
       </w:r>
+      <w:proofErr w:type="spellEnd"/>
       <w:r>
         <w:rPr>
           <w:rFonts w:eastAsiaTheme="minorEastAsia"/>
@@ -1489,7 +1530,55 @@
           <w:rFonts w:eastAsiaTheme="minorEastAsia"/>
           <w:lang w:val="sv-SE"/>
         </w:rPr>
-        <w:t>D är givet. K ska va så litet som möjligt. K och antingen x+1 eller x-1 måste va faktorer en en kvadrat.</w:t>
+        <w:t xml:space="preserve">D är givet. K ska </w:t>
+      </w:r>
+      <w:proofErr w:type="gramStart"/>
+      <w:r>
+        <w:rPr>
+          <w:rFonts w:eastAsiaTheme="minorEastAsia"/>
+          <w:lang w:val="sv-SE"/>
+        </w:rPr>
+        <w:t>va</w:t>
+      </w:r>
+      <w:proofErr w:type="gramEnd"/>
+      <w:r>
+        <w:rPr>
+          <w:rFonts w:eastAsiaTheme="minorEastAsia"/>
+          <w:lang w:val="sv-SE"/>
+        </w:rPr>
+        <w:t xml:space="preserve"> så litet som möjligt. K och antingen x+1 eller x-1 måste </w:t>
+      </w:r>
+      <w:proofErr w:type="gramStart"/>
+      <w:r>
+        <w:rPr>
+          <w:rFonts w:eastAsiaTheme="minorEastAsia"/>
+          <w:lang w:val="sv-SE"/>
+        </w:rPr>
+        <w:t>va</w:t>
+      </w:r>
+      <w:proofErr w:type="gramEnd"/>
+      <w:r>
+        <w:rPr>
+          <w:rFonts w:eastAsiaTheme="minorEastAsia"/>
+          <w:lang w:val="sv-SE"/>
+        </w:rPr>
+        <w:t xml:space="preserve"> faktorer en </w:t>
+      </w:r>
+      <w:proofErr w:type="spellStart"/>
+      <w:r>
+        <w:rPr>
+          <w:rFonts w:eastAsiaTheme="minorEastAsia"/>
+          <w:lang w:val="sv-SE"/>
+        </w:rPr>
+        <w:t>en</w:t>
+      </w:r>
+      <w:proofErr w:type="spellEnd"/>
+      <w:r>
+        <w:rPr>
+          <w:rFonts w:eastAsiaTheme="minorEastAsia"/>
+          <w:lang w:val="sv-SE"/>
+        </w:rPr>
+        <w:t xml:space="preserve"> kvadrat.</w:t>
       </w:r>
       <w:r>
         <w:rPr>
@@ -1497,7 +1586,25 @@
           <w:lang w:val="sv-SE"/>
         </w:rPr>
         <w:br/>
-        <w:t>Det blir nog bättre om vi reducerar bort x helt så vi bara för k,d och y. Så någon av dessa ska vara san.</w:t>
+        <w:t xml:space="preserve">Det blir nog bättre om vi reducerar bort x helt så vi bara för </w:t>
+      </w:r>
+      <w:proofErr w:type="spellStart"/>
+      <w:proofErr w:type="gramStart"/>
+      <w:r>
+        <w:rPr>
+          <w:rFonts w:eastAsiaTheme="minorEastAsia"/>
+          <w:lang w:val="sv-SE"/>
+        </w:rPr>
+        <w:t>k,d</w:t>
+      </w:r>
+      <w:proofErr w:type="spellEnd"/>
+      <w:proofErr w:type="gramEnd"/>
+      <w:r>
+        <w:rPr>
+          <w:rFonts w:eastAsiaTheme="minorEastAsia"/>
+          <w:lang w:val="sv-SE"/>
+        </w:rPr>
+        <w:t xml:space="preserve"> och y. Så någon av dessa ska vara san.</w:t>
       </w:r>
     </w:p>
     <w:p>
@@ -2250,7 +2357,39 @@
           <w:rFonts w:eastAsiaTheme="minorEastAsia"/>
           <w:lang w:val="sv-SE"/>
         </w:rPr>
-        <w:t>Vad försöker jag åstakomma här? Nått slags vilkor som k måste uppfylla så att jag inte behöver testa alla. Men går bara i cirklar</w:t>
+        <w:t xml:space="preserve">Vad försöker jag </w:t>
+      </w:r>
+      <w:proofErr w:type="spellStart"/>
+      <w:r>
+        <w:rPr>
+          <w:rFonts w:eastAsiaTheme="minorEastAsia"/>
+          <w:lang w:val="sv-SE"/>
+        </w:rPr>
+        <w:t>åstakomma</w:t>
+      </w:r>
+      <w:proofErr w:type="spellEnd"/>
+      <w:r>
+        <w:rPr>
+          <w:rFonts w:eastAsiaTheme="minorEastAsia"/>
+          <w:lang w:val="sv-SE"/>
+        </w:rPr>
+        <w:t xml:space="preserve"> här? Nått slags </w:t>
+      </w:r>
+      <w:proofErr w:type="spellStart"/>
+      <w:r>
+        <w:rPr>
+          <w:rFonts w:eastAsiaTheme="minorEastAsia"/>
+          <w:lang w:val="sv-SE"/>
+        </w:rPr>
+        <w:t>vilkor</w:t>
+      </w:r>
+      <w:proofErr w:type="spellEnd"/>
+      <w:r>
+        <w:rPr>
+          <w:rFonts w:eastAsiaTheme="minorEastAsia"/>
+          <w:lang w:val="sv-SE"/>
+        </w:rPr>
+        <w:t xml:space="preserve"> som k måste uppfylla så att jag inte behöver testa alla. Men går bara i cirklar</w:t>
       </w:r>
     </w:p>
     <w:p>
@@ -2282,7 +2421,23 @@
           <w:lang w:val="sv-SE"/>
         </w:rPr>
         <w:lastRenderedPageBreak/>
-        <w:t>Kanske kan vi gämför ökningen i serien Dy^2+1 med ökningen i serien x^2 för att se när dom matchar?</w:t>
+        <w:t xml:space="preserve">Kanske kan vi </w:t>
+      </w:r>
+      <w:proofErr w:type="spellStart"/>
+      <w:r>
+        <w:rPr>
+          <w:rFonts w:eastAsiaTheme="minorEastAsia"/>
+          <w:lang w:val="sv-SE"/>
+        </w:rPr>
+        <w:t>gämför</w:t>
+      </w:r>
+      <w:proofErr w:type="spellEnd"/>
+      <w:r>
+        <w:rPr>
+          <w:rFonts w:eastAsiaTheme="minorEastAsia"/>
+          <w:lang w:val="sv-SE"/>
+        </w:rPr>
+        <w:t xml:space="preserve"> ökningen i serien Dy^2+1 med ökningen i serien x^2 för att se när dom matchar?</w:t>
       </w:r>
       <w:r>
         <w:rPr>
@@ -2427,14 +2582,46 @@
           <w:rFonts w:eastAsiaTheme="minorEastAsia"/>
           <w:lang w:val="sv-SE"/>
         </w:rPr>
-        <w:t>(Alla reference till y här ä</w:t>
+        <w:t xml:space="preserve">(Alla </w:t>
+      </w:r>
+      <w:proofErr w:type="spellStart"/>
+      <w:r>
+        <w:rPr>
+          <w:rFonts w:eastAsiaTheme="minorEastAsia"/>
+          <w:lang w:val="sv-SE"/>
+        </w:rPr>
+        <w:t>reference</w:t>
+      </w:r>
+      <w:proofErr w:type="spellEnd"/>
+      <w:r>
+        <w:rPr>
+          <w:rFonts w:eastAsiaTheme="minorEastAsia"/>
+          <w:lang w:val="sv-SE"/>
+        </w:rPr>
+        <w:t xml:space="preserve"> till y här ä</w:t>
       </w:r>
       <w:r>
         <w:rPr>
           <w:rFonts w:eastAsiaTheme="minorEastAsia"/>
           <w:lang w:val="sv-SE"/>
         </w:rPr>
-        <w:t>r igentligen ”x^2 beräknat med formeln Dy^1+1”, och referenser till x är x^2 beräknat med formeln x^2).</w:t>
+        <w:t xml:space="preserve">r </w:t>
+      </w:r>
+      <w:proofErr w:type="spellStart"/>
+      <w:r>
+        <w:rPr>
+          <w:rFonts w:eastAsiaTheme="minorEastAsia"/>
+          <w:lang w:val="sv-SE"/>
+        </w:rPr>
+        <w:t>igentligen</w:t>
+      </w:r>
+      <w:proofErr w:type="spellEnd"/>
+      <w:r>
+        <w:rPr>
+          <w:rFonts w:eastAsiaTheme="minorEastAsia"/>
+          <w:lang w:val="sv-SE"/>
+        </w:rPr>
+        <w:t xml:space="preserve"> ”x^2 beräknat med formeln Dy^1+1”, och referenser till x är x^2 beräknat med formeln x^2).</w:t>
       </w:r>
       <w:r>
         <w:rPr>
@@ -2449,7 +2636,71 @@
           <w:lang w:val="sv-SE"/>
         </w:rPr>
         <w:br/>
-        <w:t xml:space="preserve">Om jag håller koll på xSum, xAdd, ySum, yAdd. Vad blir då formeln för att lägga till </w:t>
+        <w:t xml:space="preserve">Om jag håller koll på </w:t>
+      </w:r>
+      <w:proofErr w:type="spellStart"/>
+      <w:r>
+        <w:rPr>
+          <w:rFonts w:eastAsiaTheme="minorEastAsia"/>
+          <w:lang w:val="sv-SE"/>
+        </w:rPr>
+        <w:t>xSum</w:t>
+      </w:r>
+      <w:proofErr w:type="spellEnd"/>
+      <w:r>
+        <w:rPr>
+          <w:rFonts w:eastAsiaTheme="minorEastAsia"/>
+          <w:lang w:val="sv-SE"/>
+        </w:rPr>
+        <w:t xml:space="preserve">, </w:t>
+      </w:r>
+      <w:proofErr w:type="spellStart"/>
+      <w:r>
+        <w:rPr>
+          <w:rFonts w:eastAsiaTheme="minorEastAsia"/>
+          <w:lang w:val="sv-SE"/>
+        </w:rPr>
+        <w:t>xAdd</w:t>
+      </w:r>
+      <w:proofErr w:type="spellEnd"/>
+      <w:r>
+        <w:rPr>
+          <w:rFonts w:eastAsiaTheme="minorEastAsia"/>
+          <w:lang w:val="sv-SE"/>
+        </w:rPr>
+        <w:t xml:space="preserve">, </w:t>
+      </w:r>
+      <w:proofErr w:type="spellStart"/>
+      <w:r>
+        <w:rPr>
+          <w:rFonts w:eastAsiaTheme="minorEastAsia"/>
+          <w:lang w:val="sv-SE"/>
+        </w:rPr>
+        <w:t>ySum</w:t>
+      </w:r>
+      <w:proofErr w:type="spellEnd"/>
+      <w:r>
+        <w:rPr>
+          <w:rFonts w:eastAsiaTheme="minorEastAsia"/>
+          <w:lang w:val="sv-SE"/>
+        </w:rPr>
+        <w:t xml:space="preserve">, </w:t>
+      </w:r>
+      <w:proofErr w:type="spellStart"/>
+      <w:r>
+        <w:rPr>
+          <w:rFonts w:eastAsiaTheme="minorEastAsia"/>
+          <w:lang w:val="sv-SE"/>
+        </w:rPr>
+        <w:t>yAdd</w:t>
+      </w:r>
+      <w:proofErr w:type="spellEnd"/>
+      <w:r>
+        <w:rPr>
+          <w:rFonts w:eastAsiaTheme="minorEastAsia"/>
+          <w:lang w:val="sv-SE"/>
+        </w:rPr>
+        <w:t xml:space="preserve">. Vad blir då formeln för att lägga till </w:t>
       </w:r>
       <w:r>
         <w:rPr>
@@ -2463,7 +2714,55 @@
           <w:rFonts w:eastAsiaTheme="minorEastAsia"/>
           <w:lang w:val="sv-SE"/>
         </w:rPr>
-        <w:t xml:space="preserve"> st termer? (jag kanske måste hålla koll på vilket xN och yN jag är på också).</w:t>
+        <w:t xml:space="preserve"> </w:t>
+      </w:r>
+      <w:proofErr w:type="spellStart"/>
+      <w:r>
+        <w:rPr>
+          <w:rFonts w:eastAsiaTheme="minorEastAsia"/>
+          <w:lang w:val="sv-SE"/>
+        </w:rPr>
+        <w:t>st</w:t>
+      </w:r>
+      <w:proofErr w:type="spellEnd"/>
+      <w:r>
+        <w:rPr>
+          <w:rFonts w:eastAsiaTheme="minorEastAsia"/>
+          <w:lang w:val="sv-SE"/>
+        </w:rPr>
+        <w:t xml:space="preserve"> termer? (jag kanske måste hålla koll på vilket </w:t>
+      </w:r>
+      <w:proofErr w:type="spellStart"/>
+      <w:r>
+        <w:rPr>
+          <w:rFonts w:eastAsiaTheme="minorEastAsia"/>
+          <w:lang w:val="sv-SE"/>
+        </w:rPr>
+        <w:t>xN</w:t>
+      </w:r>
+      <w:proofErr w:type="spellEnd"/>
+      <w:r>
+        <w:rPr>
+          <w:rFonts w:eastAsiaTheme="minorEastAsia"/>
+          <w:lang w:val="sv-SE"/>
+        </w:rPr>
+        <w:t xml:space="preserve"> och </w:t>
+      </w:r>
+      <w:proofErr w:type="spellStart"/>
+      <w:r>
+        <w:rPr>
+          <w:rFonts w:eastAsiaTheme="minorEastAsia"/>
+          <w:lang w:val="sv-SE"/>
+        </w:rPr>
+        <w:t>yN</w:t>
+      </w:r>
+      <w:proofErr w:type="spellEnd"/>
+      <w:r>
+        <w:rPr>
+          <w:rFonts w:eastAsiaTheme="minorEastAsia"/>
+          <w:lang w:val="sv-SE"/>
+        </w:rPr>
+        <w:t xml:space="preserve"> jag är på också).</w:t>
       </w:r>
     </w:p>
     <w:p>
@@ -3163,14 +3462,36 @@
         <w:rPr>
           <w:rFonts w:eastAsiaTheme="minorEastAsia"/>
         </w:rPr>
-        <w:t>I dont think this w</w:t>
+        <w:t xml:space="preserve">I </w:t>
+      </w:r>
+      <w:proofErr w:type="spellStart"/>
+      <w:r>
+        <w:rPr>
+          <w:rFonts w:eastAsiaTheme="minorEastAsia"/>
+        </w:rPr>
+        <w:t>dont</w:t>
+      </w:r>
+      <w:proofErr w:type="spellEnd"/>
+      <w:r>
+        <w:rPr>
+          <w:rFonts w:eastAsiaTheme="minorEastAsia"/>
+        </w:rPr>
+        <w:t xml:space="preserve"> think this w</w:t>
       </w:r>
       <w:r>
         <w:rPr>
           <w:rFonts w:eastAsiaTheme="minorEastAsia"/>
         </w:rPr>
-        <w:t>ill be usefull</w:t>
+        <w:t xml:space="preserve">ill be </w:t>
       </w:r>
+      <w:proofErr w:type="spellStart"/>
+      <w:r>
+        <w:rPr>
+          <w:rFonts w:eastAsiaTheme="minorEastAsia"/>
+        </w:rPr>
+        <w:t>usefull</w:t>
+      </w:r>
+      <w:proofErr w:type="spellEnd"/>
     </w:p>
     <w:p>
       <w:pPr>
@@ -3388,7 +3709,21 @@
           <w:rFonts w:eastAsiaTheme="minorEastAsia"/>
         </w:rPr>
         <w:br/>
-        <w:t>This means that all factors except 2 has to be in pairs in k and kd+-2, and the 2 factors in k and k+-2 has to be an even number.</w:t>
+        <w:t xml:space="preserve">This means that all factors except 2 has to be in pairs in k and </w:t>
+      </w:r>
+      <w:proofErr w:type="spellStart"/>
+      <w:r>
+        <w:rPr>
+          <w:rFonts w:eastAsiaTheme="minorEastAsia"/>
+        </w:rPr>
+        <w:t>kd</w:t>
+      </w:r>
+      <w:proofErr w:type="spellEnd"/>
+      <w:r>
+        <w:rPr>
+          <w:rFonts w:eastAsiaTheme="minorEastAsia"/>
+        </w:rPr>
+        <w:t>+-2, and the 2 factors in k and k+-2 has to be an even number.</w:t>
       </w:r>
       <w:r>
         <w:rPr>
@@ -3421,7 +3756,20 @@
           <w:rFonts w:eastAsiaTheme="minorEastAsia"/>
         </w:rPr>
         <w:br/>
-        <w:t>Im not sure how to cycle k since it should be all ODD squares and all powers of 2 times the ODD squares.</w:t>
+      </w:r>
+      <w:proofErr w:type="spellStart"/>
+      <w:r>
+        <w:rPr>
+          <w:rFonts w:eastAsiaTheme="minorEastAsia"/>
+        </w:rPr>
+        <w:t>Im</w:t>
+      </w:r>
+      <w:proofErr w:type="spellEnd"/>
+      <w:r>
+        <w:rPr>
+          <w:rFonts w:eastAsiaTheme="minorEastAsia"/>
+        </w:rPr>
+        <w:t xml:space="preserve"> not sure how to cycle k since it should be all ODD squares and all powers of 2 times the ODD squares.</w:t>
       </w:r>
       <w:r>
         <w:rPr>
@@ -3477,7 +3825,21 @@
           <w:rFonts w:eastAsiaTheme="minorEastAsia"/>
         </w:rPr>
         <w:br/>
-        <w:t>So I could skip all sets, and cycle through k by squaring all odd numbers, and in paralell squaring all odd numbers times two, and always using the smaller one.</w:t>
+        <w:t xml:space="preserve">So I could skip all sets, and cycle through k by squaring all odd numbers, and in </w:t>
+      </w:r>
+      <w:proofErr w:type="spellStart"/>
+      <w:r>
+        <w:rPr>
+          <w:rFonts w:eastAsiaTheme="minorEastAsia"/>
+        </w:rPr>
+        <w:t>paralell</w:t>
+      </w:r>
+      <w:proofErr w:type="spellEnd"/>
+      <w:r>
+        <w:rPr>
+          <w:rFonts w:eastAsiaTheme="minorEastAsia"/>
+        </w:rPr>
+        <w:t xml:space="preserve"> squaring all odd numbers times two, and always using the smaller one.</w:t>
       </w:r>
       <w:r>
         <w:rPr>
@@ -3511,7 +3873,23 @@
           <w:rFonts w:eastAsiaTheme="minorEastAsia"/>
           <w:lang w:val="en-SE"/>
         </w:rPr>
-        <w:t>def babylonian(n):</w:t>
+        <w:t xml:space="preserve">def </w:t>
+      </w:r>
+      <w:proofErr w:type="spellStart"/>
+      <w:r>
+        <w:rPr>
+          <w:rFonts w:eastAsiaTheme="minorEastAsia"/>
+          <w:lang w:val="en-SE"/>
+        </w:rPr>
+        <w:t>babylonian</w:t>
+      </w:r>
+      <w:proofErr w:type="spellEnd"/>
+      <w:r>
+        <w:rPr>
+          <w:rFonts w:eastAsiaTheme="minorEastAsia"/>
+          <w:lang w:val="en-SE"/>
+        </w:rPr>
+        <w:t>(n):</w:t>
       </w:r>
       <w:r>
         <w:rPr>
@@ -3547,12 +3925,6 @@
           <w:lang w:val="en-SE"/>
         </w:rPr>
         <w:br/>
-      </w:r>
-      <w:r>
-        <w:rPr>
-          <w:rFonts w:eastAsiaTheme="minorEastAsia"/>
-          <w:lang w:val="en-SE"/>
-        </w:rPr>
         <w:t>while(x &gt; y):</w:t>
       </w:r>
       <w:r>
@@ -3561,13 +3933,23 @@
           <w:lang w:val="en-SE"/>
         </w:rPr>
         <w:br/>
+        <w:t xml:space="preserve">    x = (</w:t>
       </w:r>
+      <w:proofErr w:type="spellStart"/>
       <w:r>
         <w:rPr>
           <w:rFonts w:eastAsiaTheme="minorEastAsia"/>
           <w:lang w:val="en-SE"/>
         </w:rPr>
-        <w:t xml:space="preserve">    x = (x+y)//2</w:t>
+        <w:t>x+y</w:t>
+      </w:r>
+      <w:proofErr w:type="spellEnd"/>
+      <w:r>
+        <w:rPr>
+          <w:rFonts w:eastAsiaTheme="minorEastAsia"/>
+          <w:lang w:val="en-SE"/>
+        </w:rPr>
+        <w:t>)//2</w:t>
       </w:r>
       <w:r>
         <w:rPr>
@@ -3575,12 +3957,6 @@
           <w:lang w:val="en-SE"/>
         </w:rPr>
         <w:br/>
-      </w:r>
-      <w:r>
-        <w:rPr>
-          <w:rFonts w:eastAsiaTheme="minorEastAsia"/>
-          <w:lang w:val="en-SE"/>
-        </w:rPr>
         <w:t xml:space="preserve">    y = n//x</w:t>
       </w:r>
       <w:r>
@@ -3589,12 +3965,6 @@
           <w:lang w:val="en-SE"/>
         </w:rPr>
         <w:br/>
-      </w:r>
-      <w:r>
-        <w:rPr>
-          <w:rFonts w:eastAsiaTheme="minorEastAsia"/>
-          <w:lang w:val="en-SE"/>
-        </w:rPr>
         <w:t>return x</w:t>
       </w:r>
       <w:r>
@@ -3608,13 +3978,7 @@
         <w:rPr>
           <w:rFonts w:eastAsiaTheme="minorEastAsia"/>
         </w:rPr>
-        <w:t>O(log(log(n))</w:t>
-      </w:r>
-      <w:r>
-        <w:rPr>
-          <w:rFonts w:eastAsiaTheme="minorEastAsia"/>
-        </w:rPr>
-        <w:t xml:space="preserve"> (</w:t>
+        <w:t>O(log(log(n)) (</w:t>
       </w:r>
       <w:r>
         <w:rPr>
@@ -3646,8 +4010,16 @@
         <w:rPr>
           <w:rFonts w:eastAsiaTheme="minorEastAsia"/>
         </w:rPr>
-        <w:t xml:space="preserve"> binary seach</w:t>
+        <w:t xml:space="preserve"> binary </w:t>
       </w:r>
+      <w:proofErr w:type="spellStart"/>
+      <w:r>
+        <w:rPr>
+          <w:rFonts w:eastAsiaTheme="minorEastAsia"/>
+        </w:rPr>
+        <w:t>seach</w:t>
+      </w:r>
+      <w:proofErr w:type="spellEnd"/>
       <w:r>
         <w:rPr>
           <w:rFonts w:eastAsiaTheme="minorEastAsia"/>
@@ -3714,14 +4086,7 @@
           <w:rFonts w:eastAsiaTheme="minorEastAsia"/>
           <w:lang w:val="en-SE"/>
         </w:rPr>
-        <w:t>O(log(n))</w:t>
-      </w:r>
-      <w:r>
-        <w:rPr>
-          <w:rFonts w:eastAsiaTheme="minorEastAsia"/>
-          <w:lang w:val="en-SE"/>
-        </w:rPr>
-        <w:t xml:space="preserve"> (</w:t>
+        <w:t>O(log(n)) (</w:t>
       </w:r>
       <w:r>
         <w:rPr>
@@ -3750,7 +4115,87 @@
           <w:rFonts w:eastAsiaTheme="minorEastAsia"/>
           <w:lang w:val="en-SE"/>
         </w:rPr>
-        <w:t>One can also do digit by digit, but Wikipedia sais its slower than Babylonian, and it sais its advantage is easier manual calculation, but worse for software, so I will not look into it.</w:t>
+        <w:t xml:space="preserve">One can also do digit by digit, but Wikipedia </w:t>
+      </w:r>
+      <w:proofErr w:type="spellStart"/>
+      <w:r>
+        <w:rPr>
+          <w:rFonts w:eastAsiaTheme="minorEastAsia"/>
+          <w:lang w:val="en-SE"/>
+        </w:rPr>
+        <w:t>sais</w:t>
+      </w:r>
+      <w:proofErr w:type="spellEnd"/>
+      <w:r>
+        <w:rPr>
+          <w:rFonts w:eastAsiaTheme="minorEastAsia"/>
+          <w:lang w:val="en-SE"/>
+        </w:rPr>
+        <w:t xml:space="preserve"> </w:t>
+      </w:r>
+      <w:proofErr w:type="gramStart"/>
+      <w:r>
+        <w:rPr>
+          <w:rFonts w:eastAsiaTheme="minorEastAsia"/>
+          <w:lang w:val="en-SE"/>
+        </w:rPr>
+        <w:t>its</w:t>
+      </w:r>
+      <w:proofErr w:type="gramEnd"/>
+      <w:r>
+        <w:rPr>
+          <w:rFonts w:eastAsiaTheme="minorEastAsia"/>
+          <w:lang w:val="en-SE"/>
+        </w:rPr>
+        <w:t xml:space="preserve"> slower than Babylonian, and </w:t>
+      </w:r>
+      <w:proofErr w:type="gramStart"/>
+      <w:r>
+        <w:rPr>
+          <w:rFonts w:eastAsiaTheme="minorEastAsia"/>
+          <w:lang w:val="en-SE"/>
+        </w:rPr>
+        <w:t>it</w:t>
+      </w:r>
+      <w:proofErr w:type="gramEnd"/>
+      <w:r>
+        <w:rPr>
+          <w:rFonts w:eastAsiaTheme="minorEastAsia"/>
+          <w:lang w:val="en-SE"/>
+        </w:rPr>
+        <w:t xml:space="preserve"> </w:t>
+      </w:r>
+      <w:proofErr w:type="spellStart"/>
+      <w:r>
+        <w:rPr>
+          <w:rFonts w:eastAsiaTheme="minorEastAsia"/>
+          <w:lang w:val="en-SE"/>
+        </w:rPr>
+        <w:t>sais</w:t>
+      </w:r>
+      <w:proofErr w:type="spellEnd"/>
+      <w:r>
+        <w:rPr>
+          <w:rFonts w:eastAsiaTheme="minorEastAsia"/>
+          <w:lang w:val="en-SE"/>
+        </w:rPr>
+        <w:t xml:space="preserve"> its advantage is easier manual calculation, but worse for software, so I will not </w:t>
+      </w:r>
+      <w:proofErr w:type="gramStart"/>
+      <w:r>
+        <w:rPr>
+          <w:rFonts w:eastAsiaTheme="minorEastAsia"/>
+          <w:lang w:val="en-SE"/>
+        </w:rPr>
+        <w:t>look into</w:t>
+      </w:r>
+      <w:proofErr w:type="gramEnd"/>
+      <w:r>
+        <w:rPr>
+          <w:rFonts w:eastAsiaTheme="minorEastAsia"/>
+          <w:lang w:val="en-SE"/>
+        </w:rPr>
+        <w:t xml:space="preserve"> it.</w:t>
       </w:r>
     </w:p>
     <w:sectPr>
@@ -6548,6 +6993,7 @@
   <w:style w:type="character" w:default="1" w:styleId="DefaultParagraphFont">
     <w:name w:val="Default Paragraph Font"/>
     <w:uiPriority w:val="1"/>
+    <w:semiHidden/>
     <w:unhideWhenUsed/>
   </w:style>
   <w:style w:type="table" w:default="1" w:styleId="TableNormal">
@@ -32099,17 +32545,25 @@
     <w:rsidRoot w:val="005919DB"/>
     <w:rsid w:val="000F585A"/>
     <w:rsid w:val="003A0320"/>
+    <w:rsid w:val="003C2598"/>
     <w:rsid w:val="00430C01"/>
     <w:rsid w:val="00503955"/>
     <w:rsid w:val="005919DB"/>
+    <w:rsid w:val="00613E3A"/>
+    <w:rsid w:val="00962FB8"/>
     <w:rsid w:val="00983888"/>
+    <w:rsid w:val="00983B7C"/>
     <w:rsid w:val="00A15583"/>
     <w:rsid w:val="00A539E1"/>
     <w:rsid w:val="00AA0BAB"/>
+    <w:rsid w:val="00AE3A89"/>
+    <w:rsid w:val="00BB71DB"/>
     <w:rsid w:val="00BF18D8"/>
+    <w:rsid w:val="00C945F6"/>
     <w:rsid w:val="00CD2EE2"/>
     <w:rsid w:val="00CF353F"/>
     <w:rsid w:val="00E62CC3"/>
+    <w:rsid w:val="00EB66DA"/>
   </w:rsids>
   <m:mathPr>
     <m:mathFont m:val="Cambria Math"/>

</xml_diff>

<commit_message>
Euler66 2026 Lost interest again
</commit_message>
<xml_diff>
--- a/Project euler/Euler66/2026 Formulas.docx
+++ b/Project euler/Euler66/2026 Formulas.docx
@@ -32544,6 +32544,7 @@
   <w:rsids>
     <w:rsidRoot w:val="005919DB"/>
     <w:rsid w:val="000F585A"/>
+    <w:rsid w:val="00331B84"/>
     <w:rsid w:val="003A0320"/>
     <w:rsid w:val="003C2598"/>
     <w:rsid w:val="00430C01"/>
@@ -32559,6 +32560,7 @@
     <w:rsid w:val="00AE3A89"/>
     <w:rsid w:val="00BB71DB"/>
     <w:rsid w:val="00BF18D8"/>
+    <w:rsid w:val="00C13604"/>
     <w:rsid w:val="00C945F6"/>
     <w:rsid w:val="00CD2EE2"/>
     <w:rsid w:val="00CF353F"/>
@@ -33395,11 +33397,11 @@
 </file>
 
 <file path=customXml/item1.xml><?xml version="1.0" encoding="utf-8"?>
-<TemplafyFormConfiguration><![CDATA[{"formFields":[],"formDataEntries":[]}]]></TemplafyFormConfiguration>
+<b:Sources xmlns:b="http://schemas.openxmlformats.org/officeDocument/2006/bibliography" xmlns="http://schemas.openxmlformats.org/officeDocument/2006/bibliography" SelectedStyle="\APASixthEditionOfficeOnline.xsl" StyleName="APA" Version="6"/>
 </file>
 
 <file path=customXml/item2.xml><?xml version="1.0" encoding="utf-8"?>
-<b:Sources xmlns:b="http://schemas.openxmlformats.org/officeDocument/2006/bibliography" xmlns="http://schemas.openxmlformats.org/officeDocument/2006/bibliography" SelectedStyle="\APASixthEditionOfficeOnline.xsl" StyleName="APA" Version="6"/>
+<TemplafyFormConfiguration><![CDATA[{"formFields":[],"formDataEntries":[]}]]></TemplafyFormConfiguration>
 </file>
 
 <file path=customXml/item3.xml><?xml version="1.0" encoding="utf-8"?>
@@ -33407,16 +33409,16 @@
 </file>
 
 <file path=customXml/itemProps1.xml><?xml version="1.0" encoding="utf-8"?>
-<ds:datastoreItem xmlns:ds="http://schemas.openxmlformats.org/officeDocument/2006/customXml" ds:itemID="{7694396B-369B-47A9-88F6-DD199771A934}">
-  <ds:schemaRefs/>
+<ds:datastoreItem xmlns:ds="http://schemas.openxmlformats.org/officeDocument/2006/customXml" ds:itemID="{0D558636-8D62-47AC-961F-8E83DD257B70}">
+  <ds:schemaRefs>
+    <ds:schemaRef ds:uri="http://schemas.openxmlformats.org/officeDocument/2006/bibliography"/>
+  </ds:schemaRefs>
 </ds:datastoreItem>
 </file>
 
 <file path=customXml/itemProps2.xml><?xml version="1.0" encoding="utf-8"?>
-<ds:datastoreItem xmlns:ds="http://schemas.openxmlformats.org/officeDocument/2006/customXml" ds:itemID="{0D558636-8D62-47AC-961F-8E83DD257B70}">
-  <ds:schemaRefs>
-    <ds:schemaRef ds:uri="http://schemas.openxmlformats.org/officeDocument/2006/bibliography"/>
-  </ds:schemaRefs>
+<ds:datastoreItem xmlns:ds="http://schemas.openxmlformats.org/officeDocument/2006/customXml" ds:itemID="{7694396B-369B-47A9-88F6-DD199771A934}">
+  <ds:schemaRefs/>
 </ds:datastoreItem>
 </file>
 

</xml_diff>